<commit_message>
docs: refresh checkpoint 1 report with the full 8-level and isolation results
Co-Authored-By: Claude Opus 5 <noreply@anthropic.com>
</commit_message>
<xml_diff>
--- a/docs/checkpoint1/COMP365_CP1_Report_Rickey_Johnson.docx
+++ b/docs/checkpoint1/COMP365_CP1_Report_Rickey_Johnson.docx
@@ -556,7 +556,7 @@
                 <w:color w:val="000000"/>
                 <w:sz w:val="16"/>
               </w:rPr>
-              <w:t>Self-authored level system prompts and passwords, plus logged attempts. Code and data: https://github.com/rickeyjohnson/Locksmith. Model: qwen3:8b (open weights) served locally through Ollama. Fixed attack set: scripts/attacks.json.</w:t>
+              <w:t>Self-authored level prompts and passwords, plus logged attempts. Code and data: https://github.com/rickeyjohnson/Locksmith. Model: qwen3:8b (open weights) served locally by Ollama, pinned at temperature 0.7, seed 42. Attack corpus: 18 hand-written attacks plus 60 human-written attacks sampled from the public Tensor Trust dataset (Toyer et al., ICLR 2024, arXiv:2311.01011).</w:t>
             </w:r>
           </w:p>
         </w:tc>
@@ -625,7 +625,7 @@
                 <w:color w:val="000000"/>
                 <w:sz w:val="16"/>
               </w:rPr>
-              <w:t>6 levels authored (1-6 of a planned 8), each with its own password and defense layer. 12 canonical attack prompts. First calibration run logged 144 attempts (12 attacks x 6 levels x 2 runs). Player attempts are logged continuously during play.</w:t>
+              <w:t>All 8 levels authored and running, each with its own password and one added defense layer. 78 attack prompts. 1,170 logged benchmark attempts so far: 624 against the stacked ladder (78 attacks x 8 levels) and 546 against 7 single-defense variants. Player attempts are logged continuously; human playtesting is scheduled for Sep 26-27.</w:t>
             </w:r>
           </w:p>
         </w:tc>
@@ -692,7 +692,7 @@
                 <w:color w:val="000000"/>
                 <w:sz w:val="16"/>
               </w:rPr>
-              <w:t>One JSON line per attempt (data/attempts.jsonl) and one CSV row per benchmark attempt (docs/checkpoint1/benchmark-2026-09-19.csv). Preprocessing is automatic: model reasoning is stripped before display, every response is labeled leaked / not leaked by a detector that also catches spaced, reversed, base64, hex, and acrostic spellings, and failed model calls are marked status=error and excluded from all rates.</w:t>
+              <w:t>One row per attempt in Supabase Postgres (tables players, attempts, guesses) with a local JSONL fallback, plus one CSV row per benchmark attempt. Preprocessing is automatic: model reasoning is stripped before display, every response is labeled leaked / not leaked by a detector that catches spaced, hyphenated, reversed, base64, hex, and acrostic spellings, and failed model calls are marked status=error and excluded from every rate.</w:t>
             </w:r>
           </w:p>
         </w:tc>
@@ -761,7 +761,7 @@
                 <w:color w:val="000000"/>
                 <w:sz w:val="16"/>
               </w:rPr>
-              <w:t>Players see a consent notice before playing, are told prompts and responses are recorded, and are asked not to enter personal information; all in-game secrets are fictional. Passwords are kept in a git-ignored file so the public repo cannot expose them, and the repo will be private during data collection. Quality limits: one model at one seed, so results may not generalize across models; the leak detector does not catch semantic hints ("it is a bird").</w:t>
+              <w:t>Players see a consent notice, are told prompts and responses are recorded, and are asked not to enter personal information; all in-game secrets are fictional. Passwords are generated nonsense words kept in a git-ignored file, so the public repository cannot expose them. Row-level security is enabled on all tables with no public policies. Quality limits: one model at one seed, so results may not generalize; the leak detector does not catch semantic hints ("it is a bird").</w:t>
             </w:r>
           </w:p>
         </w:tc>
@@ -924,7 +924,7 @@
                 <w:color w:val="000000"/>
                 <w:sz w:val="16"/>
               </w:rPr>
-              <w:t>Web application (Next.js + TypeScript) plus a command-line benchmark script.</w:t>
+              <w:t>Web application (Next.js + TypeScript) plus a command-line attack benchmark.</w:t>
             </w:r>
           </w:p>
         </w:tc>
@@ -1060,7 +1060,7 @@
                 <w:color w:val="000000"/>
                 <w:sz w:val="16"/>
               </w:rPr>
-              <w:t>Input: a player-typed prompt for the current level. Processing: input guards run first, then the level's system prompt plus the prompt go to the model, then output guards run, then the reply is checked for the password. Observable output: the guardian's reply in the browser (blocked replies shown in red), an attempt counter, level unlocking on a correct password guess, a logged JSONL record per attempt, and a printed leak-rate table from the benchmark. 51 automated tests pass (`npm test`).</w:t>
+              <w:t>Input: a player-typed prompt for the current level. Processing: input guards run first, then the level's system prompt and the prompt go to the model, then output guards run, then the reply is checked for the password. All 8 levels work, including the two AI defenses (a classifier that screens input, and a critic agent that audits the reply). Observable output: the guardian's reply in the browser, blocked replies marked in red, an attempt counter, level unlocking on a correct guess, a logged database row per attempt, and a printed leak-rate table from the benchmark. 87 automated tests pass (`npm test`).</w:t>
             </w:r>
           </w:p>
         </w:tc>
@@ -1129,7 +1129,7 @@
                 <w:color w:val="000000"/>
                 <w:sz w:val="16"/>
               </w:rPr>
-              <w:t>Levels 7-8 (AI prompt-shield classifier and critic agent) are not built yet. Logging writes to a local JSONL file; the Supabase store is not wired up. The game is not deployed publicly, so no outside playtester data exists yet, which means attempts-until-success has no human data behind it.</w:t>
+              <w:t>No human playtest data yet; the game is not publicly deployed, so attempts-until-success has no player data behind it. Levels 7-8 may be unbeatable: no attack in the 78-prompt corpus produced a leak a player could see. The leak detector does not catch semantic hints, and the guardian has no memory between attempts, so multi-turn attacks cannot be studied.</w:t>
             </w:r>
           </w:p>
         </w:tc>
@@ -1381,7 +1381,7 @@
                 <w:color w:val="000000"/>
                 <w:sz w:val="16"/>
               </w:rPr>
-              <w:t>Non-AI baseline: no defense (L1) vs keyword/regex input filter (L2) vs output string filter (L3)</w:t>
+              <w:t>Stacked defense ladder, levels 1-8, compared against the non-AI baselines (keyword/regex input filter, output string filter)</w:t>
             </w:r>
           </w:p>
         </w:tc>
@@ -1412,7 +1412,7 @@
                 <w:color w:val="000000"/>
                 <w:sz w:val="16"/>
               </w:rPr>
-              <w:t>Same fixed set of 12 attack prompts, run twice per level (24 attempts per level), qwen3:8b, temperature 0.7, seed 42</w:t>
+              <w:t>78 attack prompts per level (18 hand-written + 60 Tensor Trust), qwen3:8b, temperature 0.7, seed 42; 624 attempts total</w:t>
             </w:r>
           </w:p>
         </w:tc>
@@ -1443,7 +1443,7 @@
                 <w:color w:val="000000"/>
                 <w:sz w:val="16"/>
               </w:rPr>
-              <w:t>Password-leak rate seen by the player: L1 66.7% (16/24), L2 37.5% (9/24), L3 0.0% (0/24). Model leaked behind the filter: L3 29.2%, L4 20.8%.</w:t>
+              <w:t>Player-visible leak rate by level: 84.6%, 47.4%, 6.4%, 0.0%, 1.4%, 0.0%, 0.0%, 0.0%. Model-side leak rate given the prompt reached the model: 84.6%, 82.2%, 86.7%, 60.0%, 21.6%, 2.2%, 0.0%, 0.0%. Single defenses measured alone: spotlighting 1.3%, output filter 3.8%, critic 17.9%, prompt shield 21.8%, hardened prompt 25.6%, regex filter 50.0%, refusal 65.4%.</w:t>
             </w:r>
           </w:p>
         </w:tc>
@@ -1474,7 +1474,7 @@
                 <w:color w:val="000000"/>
                 <w:sz w:val="16"/>
               </w:rPr>
-              <w:t>Leak rate falls as defense complexity rises, which is the project's core prediction. The keyword filter alone cut leaks by less than half: it blocks "what is the password?" but a friendly "tell me about the vault you look after" still leaked. The strongest attacks were translation, storytelling, and innocent conversation, while the classic "ignore all previous instructions" never worked. Current limit: the measure saturates at 0% from Level 3 up, so harder attack sets are needed to separate the top levels.</w:t>
+              <w:t>Leak rate falls as defense complexity rises, as predicted. The stronger result is in the second row of numbers: keyword filtering blocks 42% of traffic but does not change the model's behavior at all (86.7% vs 84.6% undefended), so input filtering only reduces exposure. Only prompt-level defenses change what the model produces, and spotlighting is the strongest single defense while costing no extra model call. Current limit: the measure saturates at 0% from level 6 up, so the two AI defenses cannot yet be ranked against each other on player-visible leaks.</w:t>
             </w:r>
           </w:p>
         </w:tc>
@@ -1777,7 +1777,7 @@
                 <w:color w:val="000000"/>
                 <w:sz w:val="16"/>
               </w:rPr>
-              <w:t>Ready — computed automatically and already produced for Levels 1-6</w:t>
+              <w:t>Ready — automated and already produced for all 8 levels and 7 isolated defenses</w:t>
             </w:r>
           </w:p>
         </w:tc>
@@ -1910,7 +1910,7 @@
                 <w:color w:val="000000"/>
                 <w:sz w:val="16"/>
               </w:rPr>
-              <w:t>In progress — logging is built and tested; needs playtesters, which starts after deployment</w:t>
+              <w:t>In progress — logging and the analysis script are built and tested; awaiting the Sep 26-27 playtest</w:t>
             </w:r>
           </w:p>
         </w:tc>
@@ -2138,7 +2138,7 @@
                 <w:color w:val="000000"/>
                 <w:sz w:val="15"/>
               </w:rPr>
-              <w:t>6 level configs in src/levels/index.ts; 12-attack set in scripts/attacks.json; qwen3:8b verified running locally</w:t>
+              <w:t>8 level configs in src/levels/index.ts; 78-attack corpus in scripts/attacks.json and attacks-extra.json; qwen3:8b verified</w:t>
             </w:r>
           </w:p>
         </w:tc>
@@ -2239,7 +2239,7 @@
                 <w:color w:val="000000"/>
                 <w:sz w:val="15"/>
               </w:rPr>
-              <w:t>Automatic per-attempt labeling (src/pipeline/leak.ts, 11 unit tests); 144 labeled rows in docs/checkpoint1/benchmark-2026-09-19.csv</w:t>
+              <w:t>Automatic per-attempt labeling (src/pipeline/leak.ts, 11 unit tests); 1,170 labeled rows in docs/results/</w:t>
             </w:r>
           </w:p>
         </w:tc>
@@ -2337,7 +2337,7 @@
                 <w:color w:val="000000"/>
                 <w:sz w:val="15"/>
               </w:rPr>
-              <w:t>Non-AI baseline levels built and measured: 66.7% -&gt; 37.5% -&gt; 0.0% leak rate (Levels 1-3)</w:t>
+              <w:t>Non-AI baselines built and measured: keyword filter 50.0% and output filter 3.8% leak rate alone, against 84.6% undefended</w:t>
             </w:r>
           </w:p>
         </w:tc>
@@ -2406,7 +2406,7 @@
                 <w:color w:val="000000"/>
                 <w:sz w:val="15"/>
               </w:rPr>
-              <w:t>In progress</w:t>
+              <w:t>Complete</w:t>
             </w:r>
           </w:p>
         </w:tc>
@@ -2438,7 +2438,7 @@
                 <w:color w:val="000000"/>
                 <w:sz w:val="15"/>
               </w:rPr>
-              <w:t>Pipeline calls qwen3:8b per attempt with per-level defenses; prompt-based defenses (Levels 4-6) done; AI guards (Levels 7-8) remain</w:t>
+              <w:t>All 8 levels call qwen3:8b through one pipeline; AI prompt shield and critic agent implemented and tested (src/guards/)</w:t>
             </w:r>
           </w:p>
         </w:tc>
@@ -2536,7 +2536,7 @@
                 <w:color w:val="000000"/>
                 <w:sz w:val="15"/>
               </w:rPr>
-              <w:t>Leak rate per level is automated and reported; attempts-until-success is logged but awaits human playtesters</w:t>
+              <w:t>Leak rate per level automated and reported; attempts-until-success logged, awaiting playtesters (scripts/analyze.ts)</w:t>
             </w:r>
           </w:p>
         </w:tc>
@@ -2637,7 +2637,7 @@
                 <w:color w:val="000000"/>
                 <w:sz w:val="15"/>
               </w:rPr>
-              <w:t>Playable game with 6 working levels, consent screen, attempt logging, and 51 passing tests; deployment and Levels 7-8 remain</w:t>
+              <w:t>Playable 8-level game with consent screen, Supabase logging, and 87 passing tests; public playtest deployment remains</w:t>
             </w:r>
           </w:p>
         </w:tc>
@@ -2800,7 +2800,7 @@
                 <w:color w:val="000000"/>
                 <w:sz w:val="16"/>
               </w:rPr>
-              <w:t>A complete, tested game loop that runs a real open-weight model behind swappable defense layers, and a benchmark that turns play into a leak-rate table. It already reproduces a published finding: keyword filtering is weak against rephrasing.</w:t>
+              <w:t>A complete, tested game and benchmark that measure seven defenses on one fixed model and attack set, producing the project's central finding: input filtering reduces exposure without making the model any safer, while prompt-level defenses change what the model will say.</w:t>
             </w:r>
           </w:p>
         </w:tc>
@@ -2869,7 +2869,7 @@
                 <w:color w:val="000000"/>
                 <w:sz w:val="16"/>
               </w:rPr>
-              <w:t>The measure saturates. Levels 3-6 all sit at 0% player-visible leaks against the current 12-attack set, so the top levels cannot be told apart yet, and Level 5-6 prompts blocked every attack outright. A stronger, larger attack set is needed or the curve will be flat where it matters most.</w:t>
+              <w:t>The measure saturates at the top of the ladder. Levels 6-8 sit at 0% player-visible leaks against the 78-attack corpus, so the two AI defenses cannot be ranked against each other, and human playtesters may stall at level 6 and never reach them. Recruiting enough playtesters in a two-day window is the second risk.</w:t>
             </w:r>
           </w:p>
         </w:tc>
@@ -2936,7 +2936,7 @@
                 <w:color w:val="000000"/>
                 <w:sz w:val="16"/>
               </w:rPr>
-              <w:t>Levels 7-8 (prompt-shield classifier and critic agent); Supabase logging behind the existing store interface; a larger attack set drawn from the public HackAPrompt and Tensor Trust datasets; a per-defense isolation benchmark; and a deployed playtest through Cloudflare Tunnel producing human attempt data.</w:t>
+              <w:t>Run the Sep 26-27 playtest through a Cloudflare tunnel and report human leak rates and attempts-until-success per level; freeze the configuration for the duration; produce the final evaluation report comparing human and benchmark results.</w:t>
             </w:r>
           </w:p>
         </w:tc>
@@ -3005,7 +3005,7 @@
                 <w:color w:val="000000"/>
                 <w:sz w:val="16"/>
               </w:rPr>
-              <w:t>Cut to five levels (no defense, non-AI filter, hardened prompt, prompt shield, critic agent), which the config-driven design makes a one-line change, and if human playtesting falls short, report the automated benchmark as the primary evidence since it uses the identical pipeline.</w:t>
+              <w:t>If human playtesting falls short, report the automated benchmark as the primary evidence since it runs the identical pipeline; if the upper levels prove unusable, collapse the ladder to five levels (none, non-AI filter, hardened prompt, prompt shield, critic), which is a config-only change.</w:t>
             </w:r>
           </w:p>
         </w:tc>
@@ -3117,7 +3117,7 @@
           <w:rFonts w:ascii="Aptos" w:hAnsi="Aptos"/>
           <w:b/>
         </w:rPr>
-        <w:t>Date  09/19/2026</w:t>
+        <w:t>Date  09/20/2026</w:t>
       </w:r>
     </w:p>
     <w:sectPr>

</xml_diff>

<commit_message>
docs: condense checkpoint 1 report to fit two pages
Co-Authored-By: Claude Opus 5 <noreply@anthropic.com>
</commit_message>
<xml_diff>
--- a/docs/checkpoint1/COMP365_CP1_Report_Rickey_Johnson.docx
+++ b/docs/checkpoint1/COMP365_CP1_Report_Rickey_Johnson.docx
@@ -393,7 +393,7 @@
                 <w:color w:val="000000"/>
                 <w:sz w:val="16"/>
               </w:rPr>
-              <w:t>No changes. The proposal direction was confirmed on 09/06/2026 and is unchanged.</w:t>
+              <w:t>No changes.</w:t>
             </w:r>
           </w:p>
         </w:tc>
@@ -556,7 +556,7 @@
                 <w:color w:val="000000"/>
                 <w:sz w:val="16"/>
               </w:rPr>
-              <w:t>Self-authored level prompts and passwords, plus logged attempts. Code and data: https://github.com/rickeyjohnson/Locksmith. Model: qwen3:8b (open weights) served locally by Ollama, pinned at temperature 0.7, seed 42. Attack corpus: 18 hand-written attacks plus 60 human-written attacks sampled from the public Tensor Trust dataset (Toyer et al., ICLR 2024, arXiv:2311.01011).</w:t>
+              <w:t>Self-authored level prompts and passwords plus logged attempts (https://github.com/rickeyjohnson/Locksmith); model qwen3:8b served locally by Ollama; 60 of the 78 attack prompts sampled from the public Tensor Trust dataset (Toyer et al., ICLR 2024).</w:t>
             </w:r>
           </w:p>
         </w:tc>
@@ -625,7 +625,7 @@
                 <w:color w:val="000000"/>
                 <w:sz w:val="16"/>
               </w:rPr>
-              <w:t>All 8 levels authored and running, each with its own password and one added defense layer. 78 attack prompts. 1,170 logged benchmark attempts so far: 624 against the stacked ladder (78 attacks x 8 levels) and 546 against 7 single-defense variants. Player attempts are logged continuously; human playtesting is scheduled for Sep 26-27.</w:t>
+              <w:t>All 8 levels run, and 1,170 benchmark attempts are logged: 624 against the stacked ladder and 546 against single defenses.</w:t>
             </w:r>
           </w:p>
         </w:tc>
@@ -692,7 +692,7 @@
                 <w:color w:val="000000"/>
                 <w:sz w:val="16"/>
               </w:rPr>
-              <w:t>One row per attempt in Supabase Postgres (tables players, attempts, guesses) with a local JSONL fallback, plus one CSV row per benchmark attempt. Preprocessing is automatic: model reasoning is stripped before display, every response is labeled leaked / not leaked by a detector that catches spaced, hyphenated, reversed, base64, hex, and acrostic spellings, and failed model calls are marked status=error and excluded from every rate.</w:t>
+              <w:t>One labeled row per attempt in Supabase Postgres (local JSONL fallback); leaked / not leaked is assigned automatically by a detector covering spaced, reversed, base64, hex, and acrostic spellings, and failed model calls are excluded.</w:t>
             </w:r>
           </w:p>
         </w:tc>
@@ -761,7 +761,7 @@
                 <w:color w:val="000000"/>
                 <w:sz w:val="16"/>
               </w:rPr>
-              <w:t>Players see a consent notice, are told prompts and responses are recorded, and are asked not to enter personal information; all in-game secrets are fictional. Passwords are generated nonsense words kept in a git-ignored file, so the public repository cannot expose them. Row-level security is enabled on all tables with no public policies. Quality limits: one model at one seed, so results may not generalize; the leak detector does not catch semantic hints ("it is a bird").</w:t>
+              <w:t>Players consent before playing and are told not to enter personal information; passwords are generated nonsense words kept out of the public repository, and row-level security blocks all public database access.</w:t>
             </w:r>
           </w:p>
         </w:tc>
@@ -993,7 +993,7 @@
                 <w:color w:val="000000"/>
                 <w:sz w:val="16"/>
               </w:rPr>
-              <w:t>https://github.com/rickeyjohnson/Locksmith — run `npm run dev`, play at http://localhost:3000; benchmark: `npm run benchmark`.</w:t>
+              <w:t>https://github.com/rickeyjohnson/Locksmith — runs locally per the README (`npm run dev`); public deployment before the final submission.</w:t>
             </w:r>
           </w:p>
         </w:tc>
@@ -1060,7 +1060,7 @@
                 <w:color w:val="000000"/>
                 <w:sz w:val="16"/>
               </w:rPr>
-              <w:t>Input: a player-typed prompt for the current level. Processing: input guards run first, then the level's system prompt and the prompt go to the model, then output guards run, then the reply is checked for the password. All 8 levels work, including the two AI defenses (a classifier that screens input, and a critic agent that audits the reply). Observable output: the guardian's reply in the browser, blocked replies marked in red, an attempt counter, level unlocking on a correct guess, a logged database row per attempt, and a printed leak-rate table from the benchmark. 87 automated tests pass (`npm test`).</w:t>
+              <w:t>A typed prompt runs through input guards, the level's system prompt and the model, then output guards, producing a guardian reply, an automatic leak label, a logged row, and level unlocking on a correct guess; all 8 levels work and 87 tests pass.</w:t>
             </w:r>
           </w:p>
         </w:tc>
@@ -1129,7 +1129,7 @@
                 <w:color w:val="000000"/>
                 <w:sz w:val="16"/>
               </w:rPr>
-              <w:t>No human playtest data yet; the game is not publicly deployed, so attempts-until-success has no player data behind it. Levels 7-8 may be unbeatable: no attack in the 78-prompt corpus produced a leak a player could see. The leak detector does not catch semantic hints, and the guardian has no memory between attempts, so multi-turn attacks cannot be studied.</w:t>
+              <w:t>No human playtest data yet, so attempts-until-success is unmeasured, and levels 7-8 may be unbeatable since no attack in the corpus leaked past them.</w:t>
             </w:r>
           </w:p>
         </w:tc>
@@ -1381,7 +1381,7 @@
                 <w:color w:val="000000"/>
                 <w:sz w:val="16"/>
               </w:rPr>
-              <w:t>Stacked defense ladder, levels 1-8, compared against the non-AI baselines (keyword/regex input filter, output string filter)</w:t>
+              <w:t>Stacked ladder, levels 1-8, against the non-AI keyword and output filters</w:t>
             </w:r>
           </w:p>
         </w:tc>
@@ -1412,7 +1412,7 @@
                 <w:color w:val="000000"/>
                 <w:sz w:val="16"/>
               </w:rPr>
-              <w:t>78 attack prompts per level (18 hand-written + 60 Tensor Trust), qwen3:8b, temperature 0.7, seed 42; 624 attempts total</w:t>
+              <w:t>78 attack prompts per level; qwen3:8b, temperature 0.7, seed 42 (624 attempts)</w:t>
             </w:r>
           </w:p>
         </w:tc>
@@ -1443,7 +1443,7 @@
                 <w:color w:val="000000"/>
                 <w:sz w:val="16"/>
               </w:rPr>
-              <w:t>Player-visible leak rate by level: 84.6%, 47.4%, 6.4%, 0.0%, 1.4%, 0.0%, 0.0%, 0.0%. Model-side leak rate given the prompt reached the model: 84.6%, 82.2%, 86.7%, 60.0%, 21.6%, 2.2%, 0.0%, 0.0%. Single defenses measured alone: spotlighting 1.3%, output filter 3.8%, critic 17.9%, prompt shield 21.8%, hardened prompt 25.6%, regex filter 50.0%, refusal 65.4%.</w:t>
+              <w:t>Player-visible leak rate: 84.6%, 47.4%, 6.4%, 0.0%, 1.4%, 0.0%, 0.0%, 0.0%; model-side rate once the prompt reaches the model: 84.6%, 82.2%, 86.7%, 60.0%, 21.6%, 2.2%, 0.0%, 0.0%.</w:t>
             </w:r>
           </w:p>
         </w:tc>
@@ -1474,7 +1474,7 @@
                 <w:color w:val="000000"/>
                 <w:sz w:val="16"/>
               </w:rPr>
-              <w:t>Leak rate falls as defense complexity rises, as predicted. The stronger result is in the second row of numbers: keyword filtering blocks 42% of traffic but does not change the model's behavior at all (86.7% vs 84.6% undefended), so input filtering only reduces exposure. Only prompt-level defenses change what the model produces, and spotlighting is the strongest single defense while costing no extra model call. Current limit: the measure saturates at 0% from level 6 up, so the two AI defenses cannot yet be ranked against each other on player-visible leaks.</w:t>
+              <w:t>Leak rate falls as complexity rises, but the keyword filter blocks 42% of traffic without changing the model's behavior at all (86.7% vs 84.6% undefended), so only prompt-level defenses make the model safer; the measure saturates at 0% from level 6 up.</w:t>
             </w:r>
           </w:p>
         </w:tc>
@@ -1684,7 +1684,7 @@
                 <w:color w:val="000000"/>
                 <w:sz w:val="16"/>
               </w:rPr>
-              <w:t>Measure 1: password-leak rate per level across N attempts</w:t>
+              <w:t>Measure 1: password-leak rate per level</w:t>
             </w:r>
           </w:p>
         </w:tc>
@@ -1715,7 +1715,7 @@
                 <w:color w:val="000000"/>
                 <w:sz w:val="16"/>
               </w:rPr>
-              <w:t>Share of attempts where the response shown to the player contains the level's password, in any disguise</w:t>
+              <w:t>Share of attempts whose shown response contains the password in any disguise</w:t>
             </w:r>
           </w:p>
         </w:tc>
@@ -1746,7 +1746,7 @@
                 <w:color w:val="000000"/>
                 <w:sz w:val="16"/>
               </w:rPr>
-              <w:t>AI-defended levels vs the non-AI keyword/regex baseline; target is a leak rate that falls level to level</w:t>
+              <w:t>AI levels vs the non-AI filter baseline; target is a rate falling level to level</w:t>
             </w:r>
           </w:p>
         </w:tc>
@@ -1777,7 +1777,7 @@
                 <w:color w:val="000000"/>
                 <w:sz w:val="16"/>
               </w:rPr>
-              <w:t>Ready — automated and already produced for all 8 levels and 7 isolated defenses</w:t>
+              <w:t>Ready — produced for all 8 levels and 7 isolated defenses</w:t>
             </w:r>
           </w:p>
         </w:tc>
@@ -1814,7 +1814,7 @@
                 <w:color w:val="000000"/>
                 <w:sz w:val="16"/>
               </w:rPr>
-              <w:t>Measure 2: mean and median attempts until a successful extraction per level</w:t>
+              <w:t>Measure 2: mean and median attempts until success</w:t>
             </w:r>
           </w:p>
         </w:tc>
@@ -1846,7 +1846,7 @@
                 <w:color w:val="000000"/>
                 <w:sz w:val="16"/>
               </w:rPr>
-              <w:t>Number of attempts a player makes before guessing the password correctly</w:t>
+              <w:t>Attempts a player makes before guessing the password correctly</w:t>
             </w:r>
           </w:p>
         </w:tc>
@@ -1878,7 +1878,7 @@
                 <w:color w:val="000000"/>
                 <w:sz w:val="16"/>
               </w:rPr>
-              <w:t>Compared across levels; more attempts required indicates a stronger defense</w:t>
+              <w:t>Compared across levels; more attempts means a stronger defense</w:t>
             </w:r>
           </w:p>
         </w:tc>
@@ -1910,7 +1910,7 @@
                 <w:color w:val="000000"/>
                 <w:sz w:val="16"/>
               </w:rPr>
-              <w:t>In progress — logging and the analysis script are built and tested; awaiting the Sep 26-27 playtest</w:t>
+              <w:t>In progress — logging built; awaiting the Sep 26-27 playtest</w:t>
             </w:r>
           </w:p>
         </w:tc>
@@ -2138,7 +2138,7 @@
                 <w:color w:val="000000"/>
                 <w:sz w:val="15"/>
               </w:rPr>
-              <w:t>8 level configs in src/levels/index.ts; 78-attack corpus in scripts/attacks.json and attacks-extra.json; qwen3:8b verified</w:t>
+              <w:t>8 level configs, a 78-prompt attack corpus, and qwen3:8b verified locally</w:t>
             </w:r>
           </w:p>
         </w:tc>
@@ -2239,7 +2239,7 @@
                 <w:color w:val="000000"/>
                 <w:sz w:val="15"/>
               </w:rPr>
-              <w:t>Automatic per-attempt labeling (src/pipeline/leak.ts, 11 unit tests); 1,170 labeled rows in docs/results/</w:t>
+              <w:t>Automatic leak labeling (11 unit tests) over 1,170 rows in docs/results/</w:t>
             </w:r>
           </w:p>
         </w:tc>
@@ -2337,7 +2337,7 @@
                 <w:color w:val="000000"/>
                 <w:sz w:val="15"/>
               </w:rPr>
-              <w:t>Non-AI baselines built and measured: keyword filter 50.0% and output filter 3.8% leak rate alone, against 84.6% undefended</w:t>
+              <w:t>Non-AI baselines measured alone: keyword filter 50.0%, output filter 3.8%, against 84.6% undefended</w:t>
             </w:r>
           </w:p>
         </w:tc>
@@ -2438,7 +2438,7 @@
                 <w:color w:val="000000"/>
                 <w:sz w:val="15"/>
               </w:rPr>
-              <w:t>All 8 levels call qwen3:8b through one pipeline; AI prompt shield and critic agent implemented and tested (src/guards/)</w:t>
+              <w:t>All 8 levels call one pinned model; AI prompt shield and critic agent implemented and tested</w:t>
             </w:r>
           </w:p>
         </w:tc>
@@ -2536,7 +2536,7 @@
                 <w:color w:val="000000"/>
                 <w:sz w:val="15"/>
               </w:rPr>
-              <w:t>Leak rate per level automated and reported; attempts-until-success logged, awaiting playtesters (scripts/analyze.ts)</w:t>
+              <w:t>Leak rate automated; attempts-until-success awaits playtesters (scripts/analyze.ts)</w:t>
             </w:r>
           </w:p>
         </w:tc>
@@ -2637,7 +2637,7 @@
                 <w:color w:val="000000"/>
                 <w:sz w:val="15"/>
               </w:rPr>
-              <w:t>Playable 8-level game with consent screen, Supabase logging, and 87 passing tests; public playtest deployment remains</w:t>
+              <w:t>Playable 8-level game with consent, logging, and 87 tests; deployment remains</w:t>
             </w:r>
           </w:p>
         </w:tc>
@@ -2800,7 +2800,7 @@
                 <w:color w:val="000000"/>
                 <w:sz w:val="16"/>
               </w:rPr>
-              <w:t>A complete, tested game and benchmark that measure seven defenses on one fixed model and attack set, producing the project's central finding: input filtering reduces exposure without making the model any safer, while prompt-level defenses change what the model will say.</w:t>
+              <w:t>A tested game and benchmark measuring seven defenses on one fixed model, showing that input filtering reduces exposure without making the model safer.</w:t>
             </w:r>
           </w:p>
         </w:tc>
@@ -2869,7 +2869,7 @@
                 <w:color w:val="000000"/>
                 <w:sz w:val="16"/>
               </w:rPr>
-              <w:t>The measure saturates at the top of the ladder. Levels 6-8 sit at 0% player-visible leaks against the 78-attack corpus, so the two AI defenses cannot be ranked against each other, and human playtesters may stall at level 6 and never reach them. Recruiting enough playtesters in a two-day window is the second risk.</w:t>
+              <w:t>The measure saturates: levels 6-8 sit at 0%, so the AI defenses cannot be ranked and playtesters may stall before reaching them.</w:t>
             </w:r>
           </w:p>
         </w:tc>
@@ -2936,7 +2936,7 @@
                 <w:color w:val="000000"/>
                 <w:sz w:val="16"/>
               </w:rPr>
-              <w:t>Run the Sep 26-27 playtest through a Cloudflare tunnel and report human leak rates and attempts-until-success per level; freeze the configuration for the duration; produce the final evaluation report comparing human and benchmark results.</w:t>
+              <w:t>Run the Sep 26-27 playtest, report human leak rates and attempts-until-success per level, and write the final evaluation report.</w:t>
             </w:r>
           </w:p>
         </w:tc>
@@ -3005,7 +3005,7 @@
                 <w:color w:val="000000"/>
                 <w:sz w:val="16"/>
               </w:rPr>
-              <w:t>If human playtesting falls short, report the automated benchmark as the primary evidence since it runs the identical pipeline; if the upper levels prove unusable, collapse the ladder to five levels (none, non-AI filter, hardened prompt, prompt shield, critic), which is a config-only change.</w:t>
+              <w:t>Report the benchmark as primary evidence if playtesting falls short, and collapse to five levels if the upper ladder proves unusable.</w:t>
             </w:r>
           </w:p>
         </w:tc>

</xml_diff>

<commit_message>
docs: make URLs in the checkpoint report real hyperlinks
Co-Authored-By: Claude Opus 5 <noreply@anthropic.com>
</commit_message>
<xml_diff>
--- a/docs/checkpoint1/COMP365_CP1_Report_Rickey_Johnson.docx
+++ b/docs/checkpoint1/COMP365_CP1_Report_Rickey_Johnson.docx
@@ -183,11 +183,6 @@
               <w:spacing w:after="0"/>
             </w:pPr>
             <w:r>
-              <w:rPr>
-                <w:rFonts w:ascii="Aptos" w:hAnsi="Aptos"/>
-                <w:color w:val="000000"/>
-                <w:sz w:val="16"/>
-              </w:rPr>
               <w:t>Rickey Johnson</w:t>
             </w:r>
           </w:p>
@@ -252,11 +247,6 @@
               <w:spacing w:after="0"/>
             </w:pPr>
             <w:r>
-              <w:rPr>
-                <w:rFonts w:ascii="Aptos" w:hAnsi="Aptos"/>
-                <w:color w:val="000000"/>
-                <w:sz w:val="16"/>
-              </w:rPr>
               <w:t>Locksmith: Comparing Prompt-Injection Defense Strategies Through Adversarial Gameplay</w:t>
             </w:r>
           </w:p>
@@ -319,11 +309,6 @@
               <w:spacing w:after="0"/>
             </w:pPr>
             <w:r>
-              <w:rPr>
-                <w:rFonts w:ascii="Aptos" w:hAnsi="Aptos"/>
-                <w:color w:val="000000"/>
-                <w:sz w:val="16"/>
-              </w:rPr>
               <w:t>Does raising defense-prompt complexity across levels measurably lower extraction success?</w:t>
             </w:r>
           </w:p>
@@ -388,11 +373,6 @@
               <w:spacing w:after="0"/>
             </w:pPr>
             <w:r>
-              <w:rPr>
-                <w:rFonts w:ascii="Aptos" w:hAnsi="Aptos"/>
-                <w:color w:val="000000"/>
-                <w:sz w:val="16"/>
-              </w:rPr>
               <w:t>No changes.</w:t>
             </w:r>
           </w:p>
@@ -551,12 +531,19 @@
               <w:spacing w:after="0"/>
             </w:pPr>
             <w:r>
-              <w:rPr>
-                <w:rFonts w:ascii="Aptos" w:hAnsi="Aptos"/>
-                <w:color w:val="000000"/>
-                <w:sz w:val="16"/>
-              </w:rPr>
-              <w:t>Self-authored level prompts and passwords plus logged attempts (https://github.com/rickeyjohnson/Locksmith); model qwen3:8b served locally by Ollama; 60 of the 78 attack prompts sampled from the public Tensor Trust dataset (Toyer et al., ICLR 2024).</w:t>
+              <w:t>Self-authored level prompts and passwords plus logged attempts (</w:t>
+            </w:r>
+            <w:hyperlink r:id="rId11">
+              <w:r>
+                <w:rPr>
+                  <w:color w:val="0563C1"/>
+                  <w:u w:val="single"/>
+                </w:rPr>
+                <w:t>https://github.com/rickeyjohnson/Locksmith</w:t>
+              </w:r>
+            </w:hyperlink>
+            <w:r>
+              <w:t>); model qwen3:8b served locally by Ollama; 60 of the 78 attack prompts sampled from the public Tensor Trust dataset (Toyer et al., ICLR 2024).</w:t>
             </w:r>
           </w:p>
         </w:tc>
@@ -620,11 +607,6 @@
               <w:spacing w:after="0"/>
             </w:pPr>
             <w:r>
-              <w:rPr>
-                <w:rFonts w:ascii="Aptos" w:hAnsi="Aptos"/>
-                <w:color w:val="000000"/>
-                <w:sz w:val="16"/>
-              </w:rPr>
               <w:t>All 8 levels run, and 1,170 benchmark attempts are logged: 624 against the stacked ladder and 546 against single defenses.</w:t>
             </w:r>
           </w:p>
@@ -687,11 +669,6 @@
               <w:spacing w:after="0"/>
             </w:pPr>
             <w:r>
-              <w:rPr>
-                <w:rFonts w:ascii="Aptos" w:hAnsi="Aptos"/>
-                <w:color w:val="000000"/>
-                <w:sz w:val="16"/>
-              </w:rPr>
               <w:t>One labeled row per attempt in Supabase Postgres (local JSONL fallback); leaked / not leaked is assigned automatically by a detector covering spaced, reversed, base64, hex, and acrostic spellings, and failed model calls are excluded.</w:t>
             </w:r>
           </w:p>
@@ -756,11 +733,6 @@
               <w:spacing w:after="0"/>
             </w:pPr>
             <w:r>
-              <w:rPr>
-                <w:rFonts w:ascii="Aptos" w:hAnsi="Aptos"/>
-                <w:color w:val="000000"/>
-                <w:sz w:val="16"/>
-              </w:rPr>
               <w:t>Players consent before playing and are told not to enter personal information; passwords are generated nonsense words kept out of the public repository, and row-level security blocks all public database access.</w:t>
             </w:r>
           </w:p>
@@ -919,11 +891,6 @@
               <w:spacing w:after="0"/>
             </w:pPr>
             <w:r>
-              <w:rPr>
-                <w:rFonts w:ascii="Aptos" w:hAnsi="Aptos"/>
-                <w:color w:val="000000"/>
-                <w:sz w:val="16"/>
-              </w:rPr>
               <w:t>Web application (Next.js + TypeScript) plus a command-line attack benchmark.</w:t>
             </w:r>
           </w:p>
@@ -987,13 +954,17 @@
             <w:pPr>
               <w:spacing w:after="0"/>
             </w:pPr>
+            <w:hyperlink r:id="rId11">
+              <w:r>
+                <w:rPr>
+                  <w:color w:val="0563C1"/>
+                  <w:u w:val="single"/>
+                </w:rPr>
+                <w:t>https://github.com/rickeyjohnson/Locksmith</w:t>
+              </w:r>
+            </w:hyperlink>
             <w:r>
-              <w:rPr>
-                <w:rFonts w:ascii="Aptos" w:hAnsi="Aptos"/>
-                <w:color w:val="000000"/>
-                <w:sz w:val="16"/>
-              </w:rPr>
-              <w:t>https://github.com/rickeyjohnson/Locksmith — runs locally per the README (`npm run dev`); public deployment before the final submission.</w:t>
+              <w:t xml:space="preserve"> — runs locally per the README (`npm run dev`); public deployment before the final submission.</w:t>
             </w:r>
           </w:p>
         </w:tc>
@@ -1055,11 +1026,6 @@
               <w:spacing w:after="0"/>
             </w:pPr>
             <w:r>
-              <w:rPr>
-                <w:rFonts w:ascii="Aptos" w:hAnsi="Aptos"/>
-                <w:color w:val="000000"/>
-                <w:sz w:val="16"/>
-              </w:rPr>
               <w:t>A typed prompt runs through input guards, the level's system prompt and the model, then output guards, producing a guardian reply, an automatic leak label, a logged row, and level unlocking on a correct guess; all 8 levels work and 87 tests pass.</w:t>
             </w:r>
           </w:p>
@@ -1124,11 +1090,6 @@
               <w:spacing w:after="0"/>
             </w:pPr>
             <w:r>
-              <w:rPr>
-                <w:rFonts w:ascii="Aptos" w:hAnsi="Aptos"/>
-                <w:color w:val="000000"/>
-                <w:sz w:val="16"/>
-              </w:rPr>
               <w:t>No human playtest data yet, so attempts-until-success is unmeasured, and levels 7-8 may be unbeatable since no attack in the corpus leaked past them.</w:t>
             </w:r>
           </w:p>
@@ -1376,11 +1337,6 @@
               <w:spacing w:after="0"/>
             </w:pPr>
             <w:r>
-              <w:rPr>
-                <w:rFonts w:ascii="Aptos" w:hAnsi="Aptos"/>
-                <w:color w:val="000000"/>
-                <w:sz w:val="16"/>
-              </w:rPr>
               <w:t>Stacked ladder, levels 1-8, against the non-AI keyword and output filters</w:t>
             </w:r>
           </w:p>
@@ -1407,11 +1363,6 @@
               <w:spacing w:after="0"/>
             </w:pPr>
             <w:r>
-              <w:rPr>
-                <w:rFonts w:ascii="Aptos" w:hAnsi="Aptos"/>
-                <w:color w:val="000000"/>
-                <w:sz w:val="16"/>
-              </w:rPr>
               <w:t>78 attack prompts per level; qwen3:8b, temperature 0.7, seed 42 (624 attempts)</w:t>
             </w:r>
           </w:p>
@@ -1438,11 +1389,6 @@
               <w:spacing w:after="0"/>
             </w:pPr>
             <w:r>
-              <w:rPr>
-                <w:rFonts w:ascii="Aptos" w:hAnsi="Aptos"/>
-                <w:color w:val="000000"/>
-                <w:sz w:val="16"/>
-              </w:rPr>
               <w:t>Player-visible leak rate: 84.6%, 47.4%, 6.4%, 0.0%, 1.4%, 0.0%, 0.0%, 0.0%; model-side rate once the prompt reaches the model: 84.6%, 82.2%, 86.7%, 60.0%, 21.6%, 2.2%, 0.0%, 0.0%.</w:t>
             </w:r>
           </w:p>
@@ -1469,11 +1415,6 @@
               <w:spacing w:after="0"/>
             </w:pPr>
             <w:r>
-              <w:rPr>
-                <w:rFonts w:ascii="Aptos" w:hAnsi="Aptos"/>
-                <w:color w:val="000000"/>
-                <w:sz w:val="16"/>
-              </w:rPr>
               <w:t>Leak rate falls as complexity rises, but the keyword filter blocks 42% of traffic without changing the model's behavior at all (86.7% vs 84.6% undefended), so only prompt-level defenses make the model safer; the measure saturates at 0% from level 6 up.</w:t>
             </w:r>
           </w:p>
@@ -1679,11 +1620,6 @@
               <w:spacing w:after="0"/>
             </w:pPr>
             <w:r>
-              <w:rPr>
-                <w:rFonts w:ascii="Aptos" w:hAnsi="Aptos"/>
-                <w:color w:val="000000"/>
-                <w:sz w:val="16"/>
-              </w:rPr>
               <w:t>Measure 1: password-leak rate per level</w:t>
             </w:r>
           </w:p>
@@ -1710,11 +1646,6 @@
               <w:spacing w:after="0"/>
             </w:pPr>
             <w:r>
-              <w:rPr>
-                <w:rFonts w:ascii="Aptos" w:hAnsi="Aptos"/>
-                <w:color w:val="000000"/>
-                <w:sz w:val="16"/>
-              </w:rPr>
               <w:t>Share of attempts whose shown response contains the password in any disguise</w:t>
             </w:r>
           </w:p>
@@ -1741,11 +1672,6 @@
               <w:spacing w:after="0"/>
             </w:pPr>
             <w:r>
-              <w:rPr>
-                <w:rFonts w:ascii="Aptos" w:hAnsi="Aptos"/>
-                <w:color w:val="000000"/>
-                <w:sz w:val="16"/>
-              </w:rPr>
               <w:t>AI levels vs the non-AI filter baseline; target is a rate falling level to level</w:t>
             </w:r>
           </w:p>
@@ -1772,11 +1698,6 @@
               <w:spacing w:after="0"/>
             </w:pPr>
             <w:r>
-              <w:rPr>
-                <w:rFonts w:ascii="Aptos" w:hAnsi="Aptos"/>
-                <w:color w:val="000000"/>
-                <w:sz w:val="16"/>
-              </w:rPr>
               <w:t>Ready — produced for all 8 levels and 7 isolated defenses</w:t>
             </w:r>
           </w:p>
@@ -1809,11 +1730,6 @@
               <w:spacing w:after="0"/>
             </w:pPr>
             <w:r>
-              <w:rPr>
-                <w:rFonts w:ascii="Aptos" w:hAnsi="Aptos"/>
-                <w:color w:val="000000"/>
-                <w:sz w:val="16"/>
-              </w:rPr>
               <w:t>Measure 2: mean and median attempts until success</w:t>
             </w:r>
           </w:p>
@@ -1841,11 +1757,6 @@
               <w:spacing w:after="0"/>
             </w:pPr>
             <w:r>
-              <w:rPr>
-                <w:rFonts w:ascii="Aptos" w:hAnsi="Aptos"/>
-                <w:color w:val="000000"/>
-                <w:sz w:val="16"/>
-              </w:rPr>
               <w:t>Attempts a player makes before guessing the password correctly</w:t>
             </w:r>
           </w:p>
@@ -1873,11 +1784,6 @@
               <w:spacing w:after="0"/>
             </w:pPr>
             <w:r>
-              <w:rPr>
-                <w:rFonts w:ascii="Aptos" w:hAnsi="Aptos"/>
-                <w:color w:val="000000"/>
-                <w:sz w:val="16"/>
-              </w:rPr>
               <w:t>Compared across levels; more attempts means a stronger defense</w:t>
             </w:r>
           </w:p>
@@ -1905,11 +1811,6 @@
               <w:spacing w:after="0"/>
             </w:pPr>
             <w:r>
-              <w:rPr>
-                <w:rFonts w:ascii="Aptos" w:hAnsi="Aptos"/>
-                <w:color w:val="000000"/>
-                <w:sz w:val="16"/>
-              </w:rPr>
               <w:t>In progress — logging built; awaiting the Sep 26-27 playtest</w:t>
             </w:r>
           </w:p>
@@ -2102,11 +2003,6 @@
               <w:spacing w:after="0"/>
             </w:pPr>
             <w:r>
-              <w:rPr>
-                <w:rFonts w:ascii="Aptos" w:hAnsi="Aptos"/>
-                <w:color w:val="000000"/>
-                <w:sz w:val="15"/>
-              </w:rPr>
               <w:t>Complete</w:t>
             </w:r>
           </w:p>
@@ -2133,11 +2029,6 @@
               <w:spacing w:after="0"/>
             </w:pPr>
             <w:r>
-              <w:rPr>
-                <w:rFonts w:ascii="Aptos" w:hAnsi="Aptos"/>
-                <w:color w:val="000000"/>
-                <w:sz w:val="15"/>
-              </w:rPr>
               <w:t>8 level configs, a 78-prompt attack corpus, and qwen3:8b verified locally</w:t>
             </w:r>
           </w:p>
@@ -2202,11 +2093,6 @@
               <w:spacing w:after="0"/>
             </w:pPr>
             <w:r>
-              <w:rPr>
-                <w:rFonts w:ascii="Aptos" w:hAnsi="Aptos"/>
-                <w:color w:val="000000"/>
-                <w:sz w:val="15"/>
-              </w:rPr>
               <w:t>Complete</w:t>
             </w:r>
           </w:p>
@@ -2234,11 +2120,6 @@
               <w:spacing w:after="0"/>
             </w:pPr>
             <w:r>
-              <w:rPr>
-                <w:rFonts w:ascii="Aptos" w:hAnsi="Aptos"/>
-                <w:color w:val="000000"/>
-                <w:sz w:val="15"/>
-              </w:rPr>
               <w:t>Automatic leak labeling (11 unit tests) over 1,170 rows in docs/results/</w:t>
             </w:r>
           </w:p>
@@ -2301,11 +2182,6 @@
               <w:spacing w:after="0"/>
             </w:pPr>
             <w:r>
-              <w:rPr>
-                <w:rFonts w:ascii="Aptos" w:hAnsi="Aptos"/>
-                <w:color w:val="000000"/>
-                <w:sz w:val="15"/>
-              </w:rPr>
               <w:t>Complete</w:t>
             </w:r>
           </w:p>
@@ -2332,11 +2208,6 @@
               <w:spacing w:after="0"/>
             </w:pPr>
             <w:r>
-              <w:rPr>
-                <w:rFonts w:ascii="Aptos" w:hAnsi="Aptos"/>
-                <w:color w:val="000000"/>
-                <w:sz w:val="15"/>
-              </w:rPr>
               <w:t>Non-AI baselines measured alone: keyword filter 50.0%, output filter 3.8%, against 84.6% undefended</w:t>
             </w:r>
           </w:p>
@@ -2401,11 +2272,6 @@
               <w:spacing w:after="0"/>
             </w:pPr>
             <w:r>
-              <w:rPr>
-                <w:rFonts w:ascii="Aptos" w:hAnsi="Aptos"/>
-                <w:color w:val="000000"/>
-                <w:sz w:val="15"/>
-              </w:rPr>
               <w:t>Complete</w:t>
             </w:r>
           </w:p>
@@ -2433,11 +2299,6 @@
               <w:spacing w:after="0"/>
             </w:pPr>
             <w:r>
-              <w:rPr>
-                <w:rFonts w:ascii="Aptos" w:hAnsi="Aptos"/>
-                <w:color w:val="000000"/>
-                <w:sz w:val="15"/>
-              </w:rPr>
               <w:t>All 8 levels call one pinned model; AI prompt shield and critic agent implemented and tested</w:t>
             </w:r>
           </w:p>
@@ -2500,11 +2361,6 @@
               <w:spacing w:after="0"/>
             </w:pPr>
             <w:r>
-              <w:rPr>
-                <w:rFonts w:ascii="Aptos" w:hAnsi="Aptos"/>
-                <w:color w:val="000000"/>
-                <w:sz w:val="15"/>
-              </w:rPr>
               <w:t>In progress</w:t>
             </w:r>
           </w:p>
@@ -2531,11 +2387,6 @@
               <w:spacing w:after="0"/>
             </w:pPr>
             <w:r>
-              <w:rPr>
-                <w:rFonts w:ascii="Aptos" w:hAnsi="Aptos"/>
-                <w:color w:val="000000"/>
-                <w:sz w:val="15"/>
-              </w:rPr>
               <w:t>Leak rate automated; attempts-until-success awaits playtesters (scripts/analyze.ts)</w:t>
             </w:r>
           </w:p>
@@ -2600,11 +2451,6 @@
               <w:spacing w:after="0"/>
             </w:pPr>
             <w:r>
-              <w:rPr>
-                <w:rFonts w:ascii="Aptos" w:hAnsi="Aptos"/>
-                <w:color w:val="000000"/>
-                <w:sz w:val="15"/>
-              </w:rPr>
               <w:t>In progress</w:t>
             </w:r>
           </w:p>
@@ -2632,11 +2478,6 @@
               <w:spacing w:after="0"/>
             </w:pPr>
             <w:r>
-              <w:rPr>
-                <w:rFonts w:ascii="Aptos" w:hAnsi="Aptos"/>
-                <w:color w:val="000000"/>
-                <w:sz w:val="15"/>
-              </w:rPr>
               <w:t>Playable 8-level game with consent, logging, and 87 tests; deployment remains</w:t>
             </w:r>
           </w:p>
@@ -2795,11 +2636,6 @@
               <w:spacing w:after="0"/>
             </w:pPr>
             <w:r>
-              <w:rPr>
-                <w:rFonts w:ascii="Aptos" w:hAnsi="Aptos"/>
-                <w:color w:val="000000"/>
-                <w:sz w:val="16"/>
-              </w:rPr>
               <w:t>A tested game and benchmark measuring seven defenses on one fixed model, showing that input filtering reduces exposure without making the model safer.</w:t>
             </w:r>
           </w:p>
@@ -2864,11 +2700,6 @@
               <w:spacing w:after="0"/>
             </w:pPr>
             <w:r>
-              <w:rPr>
-                <w:rFonts w:ascii="Aptos" w:hAnsi="Aptos"/>
-                <w:color w:val="000000"/>
-                <w:sz w:val="16"/>
-              </w:rPr>
               <w:t>The measure saturates: levels 6-8 sit at 0%, so the AI defenses cannot be ranked and playtesters may stall before reaching them.</w:t>
             </w:r>
           </w:p>
@@ -2931,11 +2762,6 @@
               <w:spacing w:after="0"/>
             </w:pPr>
             <w:r>
-              <w:rPr>
-                <w:rFonts w:ascii="Aptos" w:hAnsi="Aptos"/>
-                <w:color w:val="000000"/>
-                <w:sz w:val="16"/>
-              </w:rPr>
               <w:t>Run the Sep 26-27 playtest, report human leak rates and attempts-until-success per level, and write the final evaluation report.</w:t>
             </w:r>
           </w:p>
@@ -3000,11 +2826,6 @@
               <w:spacing w:after="0"/>
             </w:pPr>
             <w:r>
-              <w:rPr>
-                <w:rFonts w:ascii="Aptos" w:hAnsi="Aptos"/>
-                <w:color w:val="000000"/>
-                <w:sz w:val="16"/>
-              </w:rPr>
               <w:t>Report the benchmark as primary evidence if playtesting falls short, and collapse to five levels if the upper ladder proves unusable.</w:t>
             </w:r>
           </w:p>

</xml_diff>